<commit_message>
GST for tata and Shakti updated with 5% to 8.9%.
</commit_message>
<xml_diff>
--- a/templates/tata.docx
+++ b/templates/tata.docx
@@ -1238,8 +1238,6 @@
               </w:rPr>
               <w:t>5</w:t>
             </w:r>
-            <w:bookmarkStart w:id="1" w:name="_GoBack"/>
-            <w:bookmarkEnd w:id="1"/>
           </w:p>
         </w:tc>
         <w:tc>
@@ -1414,8 +1412,28 @@
                 <w:szCs w:val="24"/>
                 <w:lang w:val="en-IN" w:eastAsia="en-IN"/>
               </w:rPr>
-              <w:t>GST @ 13.8%</w:t>
+              <w:t xml:space="preserve">GST @ </w:t>
             </w:r>
+            <w:r>
+              <w:rPr>
+                <w:rFonts w:ascii="Times New Roman" w:eastAsia="Times New Roman" w:hAnsi="Times New Roman" w:cs="Times New Roman"/>
+                <w:sz w:val="24"/>
+                <w:szCs w:val="24"/>
+                <w:lang w:val="en-IN" w:eastAsia="en-IN"/>
+              </w:rPr>
+              <w:t>8.9</w:t>
+            </w:r>
+            <w:r>
+              <w:rPr>
+                <w:rFonts w:ascii="Times New Roman" w:eastAsia="Times New Roman" w:hAnsi="Times New Roman" w:cs="Times New Roman"/>
+                <w:sz w:val="24"/>
+                <w:szCs w:val="24"/>
+                <w:lang w:val="en-IN" w:eastAsia="en-IN"/>
+              </w:rPr>
+              <w:t>%</w:t>
+            </w:r>
+            <w:bookmarkStart w:id="1" w:name="_GoBack"/>
+            <w:bookmarkEnd w:id="1"/>
           </w:p>
         </w:tc>
         <w:tc>
@@ -3411,7 +3429,15 @@
           <w:spacing w:val="-1"/>
           <w:sz w:val="20"/>
         </w:rPr>
-        <w:t>12%</w:t>
+        <w:t>5</w:t>
+      </w:r>
+      <w:r>
+        <w:rPr>
+          <w:rFonts w:ascii="Charis SIL" w:hAnsi="Charis SIL" w:cs="Charis SIL"/>
+          <w:spacing w:val="-1"/>
+          <w:sz w:val="20"/>
+        </w:rPr>
+        <w:t>%</w:t>
       </w:r>
       <w:r>
         <w:rPr>
@@ -6883,7 +6909,7 @@
             </wp:anchor>
           </w:drawing>
         </mc:Choice>
-        <mc:Fallback xmlns:w16sdtfl="http://schemas.microsoft.com/office/word/2024/wordml/sdtformatlock" xmlns:w16sdtdh="http://schemas.microsoft.com/office/word/2020/wordml/sdtdatahash" xmlns:w16du="http://schemas.microsoft.com/office/word/2023/wordml/word16du" xmlns:w16="http://schemas.microsoft.com/office/word/2018/wordml" xmlns:w16cex="http://schemas.microsoft.com/office/word/2018/wordml/cex" xmlns:oel="http://schemas.microsoft.com/office/2019/extlst">
+        <mc:Fallback xmlns:oel="http://schemas.microsoft.com/office/2019/extlst" xmlns:w16cex="http://schemas.microsoft.com/office/word/2018/wordml/cex" xmlns:w16="http://schemas.microsoft.com/office/word/2018/wordml" xmlns:w16du="http://schemas.microsoft.com/office/word/2023/wordml/word16du" xmlns:w16sdtdh="http://schemas.microsoft.com/office/word/2020/wordml/sdtdatahash" xmlns:w16sdtfl="http://schemas.microsoft.com/office/word/2024/wordml/sdtformatlock">
           <w:pict>
             <v:rect w14:anchorId="060E2CF2" id="Rectangle 2" o:spid="_x0000_s1026" style="position:absolute;margin-left:0;margin-top:76.45pt;width:534pt;height:7.15pt;z-index:-15971840;visibility:visible;mso-wrap-style:square;mso-width-percent:0;mso-height-percent:0;mso-wrap-distance-left:9pt;mso-wrap-distance-top:0;mso-wrap-distance-right:9pt;mso-wrap-distance-bottom:0;mso-position-horizontal:center;mso-position-horizontal-relative:page;mso-position-vertical:absolute;mso-position-vertical-relative:page;mso-width-percent:0;mso-height-percent:0;mso-width-relative:page;mso-height-relative:page;v-text-anchor:top" o:gfxdata="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" fillcolor="#eb792c" stroked="f">
               <w10:wrap anchorx="page" anchory="page"/>
@@ -8280,7 +8306,7 @@
 </file>
 
 <file path=customXml/itemProps1.xml><?xml version="1.0" encoding="utf-8"?>
-<ds:datastoreItem xmlns:ds="http://schemas.openxmlformats.org/officeDocument/2006/customXml" ds:itemID="{BE48D25B-44B3-4BFB-A5B5-6957C55F8C86}">
+<ds:datastoreItem xmlns:ds="http://schemas.openxmlformats.org/officeDocument/2006/customXml" ds:itemID="{B055054E-6F6C-434A-A47C-197A745960B0}">
   <ds:schemaRefs>
     <ds:schemaRef ds:uri="http://schemas.openxmlformats.org/officeDocument/2006/bibliography"/>
   </ds:schemaRefs>

</xml_diff>

<commit_message>
Tata Template is updated text with 535 with 560.
</commit_message>
<xml_diff>
--- a/templates/tata.docx
+++ b/templates/tata.docx
@@ -939,7 +939,19 @@
               <w:rPr>
                 <w:rFonts w:ascii="Charis SIL" w:eastAsia="Times New Roman" w:hAnsi="Charis SIL" w:cs="Charis SIL"/>
               </w:rPr>
-              <w:t>DCR Module 535 Wp Solar Modules</w:t>
+              <w:t>DCR Module 5</w:t>
+            </w:r>
+            <w:r>
+              <w:rPr>
+                <w:rFonts w:ascii="Charis SIL" w:eastAsia="Times New Roman" w:hAnsi="Charis SIL" w:cs="Charis SIL"/>
+              </w:rPr>
+              <w:t>60</w:t>
+            </w:r>
+            <w:r>
+              <w:rPr>
+                <w:rFonts w:ascii="Charis SIL" w:eastAsia="Times New Roman" w:hAnsi="Charis SIL" w:cs="Charis SIL"/>
+              </w:rPr>
+              <w:t xml:space="preserve"> Wp Solar Modules</w:t>
             </w:r>
           </w:p>
         </w:tc>
@@ -1432,8 +1444,6 @@
               </w:rPr>
               <w:t>%</w:t>
             </w:r>
-            <w:bookmarkStart w:id="1" w:name="_GoBack"/>
-            <w:bookmarkEnd w:id="1"/>
           </w:p>
         </w:tc>
         <w:tc>
@@ -2819,8 +2829,8 @@
           <w:u w:val="thick"/>
         </w:rPr>
       </w:pPr>
-      <w:bookmarkStart w:id="2" w:name="TERMS_AND_CONDITIONS:"/>
-      <w:bookmarkEnd w:id="2"/>
+      <w:bookmarkStart w:id="1" w:name="TERMS_AND_CONDITIONS:"/>
+      <w:bookmarkEnd w:id="1"/>
     </w:p>
     <w:p>
       <w:pPr>
@@ -5646,8 +5656,8 @@
         </w:rPr>
         <w:t>warranty.</w:t>
       </w:r>
-      <w:bookmarkStart w:id="3" w:name="Highlights_of_the_Solar_Grid_Power_Plant"/>
-      <w:bookmarkEnd w:id="3"/>
+      <w:bookmarkStart w:id="2" w:name="Highlights_of_the_Solar_Grid_Power_Plant"/>
+      <w:bookmarkEnd w:id="2"/>
     </w:p>
     <w:p>
       <w:pPr>
@@ -6019,32 +6029,34 @@
           <w:rFonts w:ascii="Charis SIL" w:hAnsi="Charis SIL" w:cs="Charis SIL"/>
         </w:rPr>
       </w:pPr>
-      <w:bookmarkStart w:id="4" w:name="Parth_Gupta_(Director)"/>
+      <w:bookmarkStart w:id="3" w:name="Parth_Gupta_(Director)"/>
+      <w:bookmarkEnd w:id="3"/>
+      <w:r>
+        <w:rPr>
+          <w:rFonts w:ascii="Charis SIL" w:hAnsi="Charis SIL" w:cs="Charis SIL"/>
+        </w:rPr>
+        <w:t xml:space="preserve">Ratnesh Mishra </w:t>
+      </w:r>
+      <w:r>
+        <w:rPr>
+          <w:rFonts w:ascii="Charis SIL" w:hAnsi="Charis SIL" w:cs="Charis SIL"/>
+        </w:rPr>
+        <w:t>(</w:t>
+      </w:r>
+      <w:r>
+        <w:rPr>
+          <w:rFonts w:ascii="Charis SIL" w:hAnsi="Charis SIL" w:cs="Charis SIL"/>
+        </w:rPr>
+        <w:t>Authorized Signatory</w:t>
+      </w:r>
+      <w:r>
+        <w:rPr>
+          <w:rFonts w:ascii="Charis SIL" w:hAnsi="Charis SIL" w:cs="Charis SIL"/>
+        </w:rPr>
+        <w:t>)</w:t>
+      </w:r>
+      <w:bookmarkStart w:id="4" w:name="_GoBack"/>
       <w:bookmarkEnd w:id="4"/>
-      <w:r>
-        <w:rPr>
-          <w:rFonts w:ascii="Charis SIL" w:hAnsi="Charis SIL" w:cs="Charis SIL"/>
-        </w:rPr>
-        <w:t xml:space="preserve">Ratnesh Mishra </w:t>
-      </w:r>
-      <w:r>
-        <w:rPr>
-          <w:rFonts w:ascii="Charis SIL" w:hAnsi="Charis SIL" w:cs="Charis SIL"/>
-        </w:rPr>
-        <w:t>(</w:t>
-      </w:r>
-      <w:r>
-        <w:rPr>
-          <w:rFonts w:ascii="Charis SIL" w:hAnsi="Charis SIL" w:cs="Charis SIL"/>
-        </w:rPr>
-        <w:t>Authorized Signatory</w:t>
-      </w:r>
-      <w:r>
-        <w:rPr>
-          <w:rFonts w:ascii="Charis SIL" w:hAnsi="Charis SIL" w:cs="Charis SIL"/>
-        </w:rPr>
-        <w:t>)</w:t>
-      </w:r>
     </w:p>
     <w:p>
       <w:pPr>
@@ -6909,7 +6921,7 @@
             </wp:anchor>
           </w:drawing>
         </mc:Choice>
-        <mc:Fallback xmlns:oel="http://schemas.microsoft.com/office/2019/extlst" xmlns:w16cex="http://schemas.microsoft.com/office/word/2018/wordml/cex" xmlns:w16="http://schemas.microsoft.com/office/word/2018/wordml" xmlns:w16du="http://schemas.microsoft.com/office/word/2023/wordml/word16du" xmlns:w16sdtdh="http://schemas.microsoft.com/office/word/2020/wordml/sdtdatahash" xmlns:w16sdtfl="http://schemas.microsoft.com/office/word/2024/wordml/sdtformatlock">
+        <mc:Fallback xmlns:w16sdtfl="http://schemas.microsoft.com/office/word/2024/wordml/sdtformatlock" xmlns:w16sdtdh="http://schemas.microsoft.com/office/word/2020/wordml/sdtdatahash" xmlns:w16du="http://schemas.microsoft.com/office/word/2023/wordml/word16du" xmlns:w16="http://schemas.microsoft.com/office/word/2018/wordml" xmlns:w16cex="http://schemas.microsoft.com/office/word/2018/wordml/cex" xmlns:oel="http://schemas.microsoft.com/office/2019/extlst">
           <w:pict>
             <v:rect w14:anchorId="060E2CF2" id="Rectangle 2" o:spid="_x0000_s1026" style="position:absolute;margin-left:0;margin-top:76.45pt;width:534pt;height:7.15pt;z-index:-15971840;visibility:visible;mso-wrap-style:square;mso-width-percent:0;mso-height-percent:0;mso-wrap-distance-left:9pt;mso-wrap-distance-top:0;mso-wrap-distance-right:9pt;mso-wrap-distance-bottom:0;mso-position-horizontal:center;mso-position-horizontal-relative:page;mso-position-vertical:absolute;mso-position-vertical-relative:page;mso-width-percent:0;mso-height-percent:0;mso-width-relative:page;mso-height-relative:page;v-text-anchor:top" o:gfxdata="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" fillcolor="#eb792c" stroked="f">
               <w10:wrap anchorx="page" anchory="page"/>
@@ -8306,7 +8318,7 @@
 </file>
 
 <file path=customXml/itemProps1.xml><?xml version="1.0" encoding="utf-8"?>
-<ds:datastoreItem xmlns:ds="http://schemas.openxmlformats.org/officeDocument/2006/customXml" ds:itemID="{B055054E-6F6C-434A-A47C-197A745960B0}">
+<ds:datastoreItem xmlns:ds="http://schemas.openxmlformats.org/officeDocument/2006/customXml" ds:itemID="{7E880B47-62A7-4E92-8F2D-B580B5A15FE0}">
   <ds:schemaRefs>
     <ds:schemaRef ds:uri="http://schemas.openxmlformats.org/officeDocument/2006/bibliography"/>
   </ds:schemaRefs>

</xml_diff>